<commit_message>
Fix portfolio link formatting in resume
</commit_message>
<xml_diff>
--- a/Anand_QA_Engineer_Resume.docx
+++ b/Anand_QA_Engineer_Resume.docx
@@ -186,15 +186,24 @@
           <w:t>anandmadiwalar7@gmail.com</w:t>
         </w:r>
       </w:hyperlink>
-      <w:r>
-        <w:rPr>
-          <w:rFonts w:ascii="Calibri"/>
-          <w:color w:val="467885"/>
-          <w:spacing w:val="80"/>
-          <w:w w:val="150"/>
-        </w:rPr>
-        <w:t xml:space="preserve">  | Portfolio: https://anandmadiwalr12.github.io</w:t>
-      </w:r>
+    </w:p>
+    <w:p>
+      <w:pPr>
+        <w:jc w:val="center"/>
+        <w:spacing w:before="40" w:after="100" w:line="240" w:lineRule="auto"/>
+      </w:pPr>
+      <w:hyperlink r:id="rId10" w:history="1">
+        <w:r>
+          <w:rPr>
+            <w:rStyle w:val="Hyperlink"/>
+            <w:rFonts w:ascii="Calibri" w:hAnsi="Calibri"/>
+            <w:sz w:val="20"/>
+            <w:szCs w:val="20"/>
+            <w:spacing w:val="0"/>
+          </w:rPr>
+          <w:t>Portfolio: https://anandmadiwalr12.github.io</w:t>
+        </w:r>
+      </w:hyperlink>
     </w:p>
     <w:p>
       <w:pPr>

</xml_diff>